<commit_message>
Update institution names to MUMC+ and Celvia
</commit_message>
<xml_diff>
--- a/docs/downloads/NESTOR_D3.3_Clinical_Validation_Guidelines_v3.docx
+++ b/docs/downloads/NESTOR_D3.3_Clinical_Validation_Guidelines_v3.docx
@@ -1760,7 +1760,7 @@
         <w:rPr>
           <w:rFonts w:ascii="Arial" w:hAnsi="Arial" w:cs="Arial"/>
         </w:rPr>
-        <w:t xml:space="preserve"> NESTOR connects universities, an IVF clinic, technology SMEs and an innovation campus in the Netherlands, Estonia and Greece. Validation is where such a partnership is tested most directly. Evidence produced in one clinic in one country cannot simply be assumed to hold in another: time-lapse systems, laboratory protocols, annotation practices and patient populations differ, and so does the national implementation of EU rules on data protection, research ethics and assisted reproduction. Within the partnership, no single sector holds everything that validation requires. Academic partners bring study design, statistics and ethics expertise. Clinics bring data, clinical judgement and knowledge of the clinical workflow. SMEs bring software engineering, quality management and experience of placing regulated products on the market, and the innovation campus brings routes to valorisation. The embryo-analysis work presented here shows this model in practice: a researcher from the Greek SME Infersence (INFS), seconded to Maastricht University (UM), carried out the analysis inside the hospital’s approved computing environment in Maastricht. The expertise travelled across the border; the patient data did not.</w:t>
+        <w:t xml:space="preserve"> NESTOR connects universities, an IVF clinic, technology SMEs and an innovation campus in the Netherlands, Estonia and Greece. Validation is where such a partnership is tested most directly. Evidence produced in one clinic in one country cannot simply be assumed to hold in another: time-lapse systems, laboratory protocols, annotation practices and patient populations differ, and so does the national implementation of EU rules on data protection, research ethics and assisted reproduction. Within the partnership, no single sector holds everything that validation requires. Academic partners bring study design, statistics and ethics expertise. Clinics bring data, clinical judgement and knowledge of the clinical workflow. SMEs bring software engineering, quality management and experience of placing regulated products on the market, and the innovation campus brings routes to valorisation. The embryo-analysis work presented here shows this model in practice: a researcher from the Greek SME Infersence (INFS), seconded to Maastricht University (UM), carried out the analysis inside the approved computing environment at MUMC+. The expertise travelled across the border; the patient data did not.</w:t>
       </w:r>
     </w:p>
     <w:p>
@@ -2419,7 +2419,7 @@
                 <w:sz w:val="18"/>
                 <w:szCs w:val="18"/>
               </w:rPr>
-              <w:t>CCHT</w:t>
+              <w:t>CE</w:t>
             </w:r>
           </w:p>
         </w:tc>
@@ -2441,7 +2441,7 @@
                 <w:sz w:val="18"/>
                 <w:szCs w:val="18"/>
               </w:rPr>
-              <w:t>Competence Centre on Health Technologies (now CELVIA)</w:t>
+              <w:t>Conformité Européenne (marking)</w:t>
             </w:r>
           </w:p>
         </w:tc>
@@ -2468,7 +2468,7 @@
                 <w:sz w:val="18"/>
                 <w:szCs w:val="18"/>
               </w:rPr>
-              <w:t>CE</w:t>
+              <w:t xml:space="preserve">Celvia</w:t>
             </w:r>
           </w:p>
         </w:tc>
@@ -2490,56 +2490,7 @@
                 <w:sz w:val="18"/>
                 <w:szCs w:val="18"/>
               </w:rPr>
-              <w:t>Conformité Européenne (marking)</w:t>
-            </w:r>
-          </w:p>
-        </w:tc>
-      </w:tr>
-      <w:tr>
-        <w:trPr>
-          <w:cantSplit/>
-        </w:trPr>
-        <w:tc>
-          <w:tcPr>
-            <w:tcW w:w="2200" w:type="dxa"/>
-          </w:tcPr>
-          <w:p>
-            <w:pPr>
-              <w:spacing w:after="60" w:line="240" w:lineRule="auto"/>
-              <w:jc w:val="left"/>
-              <w:rPr>
-                <w:rFonts w:ascii="Arial" w:hAnsi="Arial" w:cs="Arial"/>
-              </w:rPr>
-            </w:pPr>
-            <w:r>
-              <w:rPr>
-                <w:rFonts w:ascii="Arial" w:hAnsi="Arial" w:cs="Arial"/>
-                <w:sz w:val="18"/>
-                <w:szCs w:val="18"/>
-              </w:rPr>
-              <w:t>CELVIA</w:t>
-            </w:r>
-          </w:p>
-        </w:tc>
-        <w:tc>
-          <w:tcPr>
-            <w:tcW w:w="7400" w:type="dxa"/>
-          </w:tcPr>
-          <w:p>
-            <w:pPr>
-              <w:spacing w:after="60" w:line="240" w:lineRule="auto"/>
-              <w:jc w:val="left"/>
-              <w:rPr>
-                <w:rFonts w:ascii="Arial" w:hAnsi="Arial" w:cs="Arial"/>
-              </w:rPr>
-            </w:pPr>
-            <w:r>
-              <w:rPr>
-                <w:rFonts w:ascii="Arial" w:hAnsi="Arial" w:cs="Arial"/>
-                <w:sz w:val="18"/>
-                <w:szCs w:val="18"/>
-              </w:rPr>
-              <w:t>Celvia (formerly CCHT)</w:t>
+              <w:t xml:space="preserve">Technology SME partner in NESTOR</w:t>
             </w:r>
           </w:p>
         </w:tc>
@@ -3941,7 +3892,7 @@
         <w:rPr>
           <w:rFonts w:ascii="Arial" w:hAnsi="Arial" w:cs="Arial"/>
         </w:rPr>
-        <w:t>Under Task T3.1 (lead: UM; participants: CCHT, AN, INFS), seconded researchers and clinical staff are trained at UM to address the practical challenges of translating research into the clinic. During their return phase, they initiate clinical validation case studies, planning all aspects from sample and patient data collection and computational analysis to reporting method precision. The Description of Action [16] foresees that seconded researchers will publish “open access web-based guidelines offering practical recommendations covering the data driven innovative method validation clinical practice of the NESTOR research sub-fields in the form of protocols and standard operating procedures”. This deliverable, together with the accompanying website, fulfils that commitment.</w:t>
+        <w:t xml:space="preserve">Under Task T3.1 (lead: UM; participants: Celvia, AN, INFS), seconded researchers and clinical staff are trained at UM to address the practical challenges of translating research into the clinic. During their return phase, they initiate clinical validation case studies, planning all aspects from sample and patient data collection and computational analysis to reporting method precision. The Description of Action [16] foresees that seconded researchers will publish “open access web-based guidelines offering practical recommendations covering the data driven innovative method validation clinical practice of the NESTOR research sub-fields in the form of protocols and standard operating procedures”. This deliverable, together with the accompanying website, fulfils that commitment.</w:t>
       </w:r>
     </w:p>
     <w:p>
@@ -3956,15 +3907,15 @@
         <w:rPr>
           <w:rFonts w:ascii="Arial" w:hAnsi="Arial" w:cs="Arial"/>
         </w:rPr>
-        <w:t xml:space="preserve"> Validation across sites depends on data that are described, consented and shared in compatible ways. Two subtasks of T3.4, both led by UM, lay these foundations [16]. Under ST3.4.1 (metadata and data-sharing consent procedures, M29), seconded researchers from INFS, AN and CCHT (now Celvia) receive hands-on training at UM in three areas: implementing data standards and shared metadata descriptions; harmonising data from existing cohorts with data-privacy safeguards; and aligning data-sharing consent terms with the providers’ data licensing and the users’ intended analyses. The last area includes registries for prospective data collection and secure access protocols for genomic, radiology and clinical records.</w:t>
-      </w:r>
-    </w:p>
-    <w:p>
-      <w:r>
-        <w:rPr>
-          <w:rFonts w:ascii="Arial" w:hAnsi="Arial" w:cs="Arial"/>
-        </w:rPr>
-        <w:t>Under ST3.4.2 (interconnected data-sharing platform, M30–35), one seconded researcher from each of the same partners spends three months at UM developing a strategy to interconnect existing data infrastructures, identify barriers to data sharing and model data sharing across the consortium. AN, as the ART service provider, implements the harmonised data collection, covering patient demographics, clinical and genomic data, and TLM images with their annotation, in line with the ST3.4.1 standards. A member of AN staff is trained in data stewardship for this purpose. INFS and CCHT run the exercises that test the interoperability of partner infrastructures, and during the return phase the seconded researchers work on data-management standards. D3.3 builds directly on this work: the metadata, consent and interoperability standards form the data layer on which the harmonised practices in Chapter 4 and the validation workflow in Chapter 5 operate.</w:t>
+        <w:t xml:space="preserve"> Validation across sites depends on data that are described, consented and shared in compatible ways. Two subtasks of T3.4, both led by UM, lay these foundations [16]. Under ST3.4.1 (metadata and data-sharing consent procedures, M29), seconded researchers from INFS, AN and Celvia receive hands-on training at UM in three areas: implementing data standards and shared metadata descriptions; harmonising data from existing cohorts with data-privacy safeguards; and aligning data-sharing consent terms with the providers’ data licensing and the users’ intended analyses. The last area includes registries for prospective data collection and secure access protocols for genomic, radiology and clinical records.</w:t>
+      </w:r>
+    </w:p>
+    <w:p>
+      <w:r>
+        <w:rPr>
+          <w:rFonts w:ascii="Arial" w:hAnsi="Arial" w:cs="Arial"/>
+        </w:rPr>
+        <w:t xml:space="preserve">Under ST3.4.2 (interconnected data-sharing platform, M30–35), one seconded researcher from each of the same partners spends three months at UM developing a strategy to interconnect existing data infrastructures, identify barriers to data sharing and model data sharing across the consortium. AN, as the ART service provider, implements the harmonised data collection, covering patient demographics, clinical and genomic data, and TLM images with their annotation, in line with the ST3.4.1 standards. A member of AN staff is trained in data stewardship for this purpose. INFS and Celvia run the exercises that test the interoperability of partner infrastructures, and during the return phase the seconded researchers work on data-management standards. D3.3 builds directly on this work: the metadata, consent and interoperability standards form the data layer on which the harmonised practices in Chapter 4 and the validation workflow in Chapter 5 operate.</w:t>
       </w:r>
     </w:p>
     <w:p>
@@ -4148,7 +4099,7 @@
         <w:rPr>
           <w:rFonts w:ascii="Arial" w:hAnsi="Arial" w:cs="Arial"/>
         </w:rPr>
-        <w:t>The embryo-analysis work presented in these guidelines was carried out through a collaboration between members of INFS and UM at the hospital in Maastricht.</w:t>
+        <w:t xml:space="preserve">The embryo-analysis work presented in these guidelines was carried out through a collaboration between members of INFS and UM at MUMC+.</w:t>
       </w:r>
     </w:p>
     <w:p>
@@ -4262,7 +4213,7 @@
         <w:rPr>
           <w:rFonts w:ascii="Arial" w:hAnsi="Arial" w:cs="Arial"/>
         </w:rPr>
-        <w:t>The NESTOR consortium spans three health systems. A method developed and evaluated in Maastricht will only be useful to a clinic in Thessaloniki or Tartu if there is evidence that it performs acceptably there. Differences between sites can affect performance in ways that are not visible in a single-site study:</w:t>
+        <w:t xml:space="preserve">The NESTOR consortium spans three health systems. A method developed and evaluated at MUMC+ will only be useful to a clinic in Thessaloniki or Tartu if there is evidence that it performs acceptably there. Differences between sites can affect performance in ways that are not visible in a single-site study:</w:t>
       </w:r>
     </w:p>
     <w:p>
@@ -4590,7 +4541,7 @@
                 <w:sz w:val="18"/>
                 <w:szCs w:val="18"/>
               </w:rPr>
-              <w:t>UM hosting the embryo-analysis work in Maastricht; training of seconded researchers under T3.1.</w:t>
+              <w:t xml:space="preserve">UM hosting the embryo-analysis work at MUMC+; training of seconded researchers under T3.1.</w:t>
             </w:r>
           </w:p>
         </w:tc>
@@ -4633,7 +4584,7 @@
                 <w:sz w:val="18"/>
                 <w:szCs w:val="18"/>
               </w:rPr>
-              <w:t xml:space="preserve"> the clinical setting in Maastricht)</w:t>
+              <w:t xml:space="preserve"> MUMC+)</w:t>
             </w:r>
           </w:p>
         </w:tc>
@@ -4712,7 +4663,7 @@
                 <w:sz w:val="18"/>
                 <w:szCs w:val="18"/>
               </w:rPr>
-              <w:t>CELVIA</w:t>
+              <w:t xml:space="preserve">Celvia</w:t>
             </w:r>
             <w:r>
               <w:rPr>
@@ -4772,7 +4723,7 @@
                 <w:sz w:val="18"/>
                 <w:szCs w:val="18"/>
               </w:rPr>
-              <w:t>CELVIA’</w:t>
+              <w:t xml:space="preserve">Celvia’</w:t>
             </w:r>
             <w:r>
               <w:rPr>
@@ -6630,7 +6581,7 @@
         <w:rPr>
           <w:rFonts w:ascii="Arial" w:hAnsi="Arial" w:cs="Arial"/>
         </w:rPr>
-        <w:t xml:space="preserve"> The embryo-analysis work in this deliverable was carried out within the hospital’s approved computing environment, because restrictions on data transfer applied. This “model-to-data” approach, in which the analysis is brought to the data rather than the other way round, reduces transfer risk and simplifies cross-border compliance. It is recommended as the default for NESTOR multi-site validation (Section 4.4).</w:t>
+        <w:t xml:space="preserve"> The embryo-analysis work in this deliverable was carried out within the approved computing environment at MUMC+, because restrictions on data transfer applied. This “model-to-data” approach, in which the analysis is brought to the data rather than the other way round, reduces transfer risk and simplifies cross-border compliance. It is recommended as the default for NESTOR multi-site validation (Section 4.4).</w:t>
       </w:r>
     </w:p>
     <w:p>
@@ -8748,7 +8699,7 @@
         <w:rPr>
           <w:rFonts w:ascii="Arial" w:hAnsi="Arial" w:cs="Arial"/>
         </w:rPr>
-        <w:t xml:space="preserve"> The model and analysis scripts travel to each site. Evaluation runs within each institution’s approved environment, and only aggregate results, such as performance measures and exclusion counts, leave the site. This is the approach used in the NESTOR embryo-analysis work in Maastricht.</w:t>
+        <w:t xml:space="preserve"> The model and analysis scripts travel to each site. Evaluation runs within each institution’s approved environment, and only aggregate results, such as performance measures and exclusion counts, leave the site. This is the approach used in the NESTOR embryo-analysis work at MUMC+.</w:t>
       </w:r>
     </w:p>
     <w:p>
@@ -10120,7 +10071,7 @@
         <w:rPr>
           <w:rFonts w:ascii="Arial" w:hAnsi="Arial" w:cs="Arial"/>
         </w:rPr>
-        <w:t>The embryo-analysis work was carried out through a collaboration between members of INFS and UM at the hospital in Maastricht.</w:t>
+        <w:t xml:space="preserve">The embryo-analysis work was carried out through a collaboration between members of INFS and UM at MUMC+.</w:t>
       </w:r>
     </w:p>
     <w:p>
@@ -10243,7 +10194,7 @@
         <w:rPr>
           <w:rFonts w:ascii="Arial" w:hAnsi="Arial" w:cs="Arial"/>
         </w:rPr>
-        <w:t>Because the images were linked to patient treatment, the analysis was carried out within the hospital’s approved computing environment in Maastricht, and the data were not transferred to the seconded researcher’s home institution.</w:t>
+        <w:t xml:space="preserve">Because the images were linked to patient treatment, the analysis was carried out within the approved computing environment at MUMC+, and the data were not transferred to the seconded researcher’s home institution.</w:t>
       </w:r>
     </w:p>
     <w:p>
@@ -11140,7 +11091,7 @@
                 <w:sz w:val="18"/>
                 <w:szCs w:val="18"/>
               </w:rPr>
-              <w:t>Analysis within the hospital’s approved environment.</w:t>
+              <w:t xml:space="preserve">Analysis within the approved environment at MUMC+.</w:t>
             </w:r>
           </w:p>
         </w:tc>
@@ -12258,7 +12209,7 @@
         <w:rPr>
           <w:rFonts w:ascii="Arial" w:hAnsi="Arial" w:cs="Arial"/>
         </w:rPr>
-        <w:t>Three lessons stand out from the work so far. First, the intended purpose of a method shapes everything that follows, from data requirements to regulatory status, so it deserves careful definition at the outset. Second, the model-to-data approach used in Maastricht is both legally prudent and practically feasible, and it provides a template for cross-border collaboration. Third, cross-sectoral secondments are an effective way of transferring validation practice: the combination of clinical, academic and industrial expertise that produced this deliverable could not have been assembled within any one partner.</w:t>
+        <w:t xml:space="preserve">Three lessons stand out from the work so far. First, the intended purpose of a method shapes everything that follows, from data requirements to regulatory status, so it deserves careful definition at the outset. Second, the model-to-data approach used at MUMC+ is both legally prudent and practically feasible, and it provides a template for cross-border collaboration. Third, cross-sectoral secondments are an effective way of transferring validation practice: the combination of clinical, academic and industrial expertise that produced this deliverable could not have been assembled within any one partner.</w:t>
       </w:r>
     </w:p>
     <w:p>
@@ -12558,7 +12509,7 @@
         <w:rPr>
           <w:rFonts w:ascii="Arial" w:hAnsi="Arial" w:cs="Arial"/>
         </w:rPr>
-        <w:t xml:space="preserve">”), a Horizon Europe project (No. 101236848) [15]. NEO-LIFE is coordinated by Alexandra Hospital in Greece and brings together Maastricht University, Celvia (formerly CCHT, Estonia), the University of Peloponnese, the AI company Quantorio and Genomedai. It therefore carries two NESTOR partners, UM and Celvia, into a new consortium that strengthens the Greek clinical and technology base. Its aim is to establish a collaborative data-sharing framework for the exchange of </w:t>
+        <w:t xml:space="preserve">”), a Horizon Europe project (No. 101236848) [15]. NEO-LIFE is coordinated by Alexandra Hospital in Greece and brings together Maastricht University, Celvia (Estonia), the University of Peloponnese, the AI company Quantorio and Genomedai. It therefore carries two NESTOR partners, UM and Celvia, into a new consortium that strengthens the Greek clinical and technology base. Its aim is to establish a collaborative data-sharing framework for the exchange of </w:t>
       </w:r>
       <w:r>
         <w:rPr>

</xml_diff>